<commit_message>
Add precision medicine, products/stages, team section, and Google content to website; update Manasa phone across all files
- index.html: Added 4 major new sections (precision medicine, products with dev stages, team bios, company info)
- about.html: Added Manasa Jampani phone (469) 499-6435 to footer contact
- contact.html: Added Manasa phone to contact page
- google-cloud-email-response.html: Updated Manasa contact block with correct phone
- ardia-profile.html: Updated Manasa phone reference
- Ardia_Health_Pitch_Deck_2026_v2.pptx: Rebuilt with precision medicine, all 4 product modules, corrected team titles/phones
- Ardia_Health_Business_Plan_2026_v2.docx: Rebuilt with precision medicine, Google-required sections, corrected team info

Co-Authored-By: Claude Sonnet 4.6 <noreply@anthropic.com>
</commit_message>
<xml_diff>
--- a/Ardia_Health_Business_Plan_2026_v2.docx
+++ b/Ardia_Health_Business_Plan_2026_v2.docx
@@ -1430,7 +1430,7 @@
                 <w:sz w:val="22"/>
                 <w:szCs w:val="22"/>
               </w:rPr>
-              <w:t xml:space="preserve">(469) 679-3334</w:t>
+              <w:t xml:space="preserve">(469) 679-3334 (Ram) / (469) 499-6435 (Manasa)</w:t>
             </w:r>
           </w:p>
         </w:tc>
@@ -2464,7 +2464,7 @@
           <w:sz w:val="24"/>
           <w:szCs w:val="24"/>
         </w:rPr>
-        <w:t xml:space="preserve">Contact: founders@ardiahealthlabs.com | (469) 679-3334</w:t>
+        <w:t xml:space="preserve">Contact: founders@ardiahealthlabs.com | (469) 499-6435</w:t>
       </w:r>
     </w:p>
     <w:p>
@@ -7664,7 +7664,7 @@
                 <w:sz w:val="22"/>
                 <w:szCs w:val="22"/>
               </w:rPr>
-              <w:t xml:space="preserve">(469) 679-3334  |  ardiahealthlabs.com</w:t>
+              <w:t xml:space="preserve">(469) 679-3334 (Ram)  ·  (469) 499-6435 (Manasa)  |  ardiahealthlabs.com</w:t>
             </w:r>
           </w:p>
           <w:p>

</xml_diff>